<commit_message>
Add project documents (Form1-4, explanations) and sample data
</commit_message>
<xml_diff>
--- a/Form1 Proposal Team-Volvo.docx
+++ b/Form1 Proposal Team-Volvo.docx
@@ -18,7 +18,7 @@
           <w:noProof/>
         </w:rPr>
         <w:drawing>
-          <wp:inline distT="0" distB="0" distL="0" distR="0">
+          <wp:inline distT="0" distB="0" distL="0" distR="0" wp14:anchorId="28C56881" wp14:editId="3846D762">
             <wp:extent cx="2154075" cy="2329025"/>
             <wp:effectExtent l="0" t="0" r="0" b="0"/>
             <wp:docPr id="7" name="image4.png" descr="President University - Wikipedia"/>
@@ -61,6 +61,8 @@
         <w:jc w:val="center"/>
         <w:rPr>
           <w:rFonts w:ascii="Times New Roman" w:eastAsia="Times New Roman" w:hAnsi="Times New Roman" w:cs="Times New Roman"/>
+          <w:b/>
+          <w:bCs/>
           <w:sz w:val="48"/>
           <w:szCs w:val="48"/>
         </w:rPr>
@@ -68,6 +70,8 @@
       <w:r>
         <w:rPr>
           <w:rFonts w:ascii="Times New Roman" w:eastAsia="Times New Roman" w:hAnsi="Times New Roman" w:cs="Times New Roman"/>
+          <w:b/>
+          <w:bCs/>
           <w:sz w:val="34"/>
           <w:szCs w:val="34"/>
         </w:rPr>
@@ -957,9 +961,7 @@
           </w:r>
           <w:r>
             <w:rPr>
-              <w:rFonts w:ascii="Times New Roman" w:eastAsia="Times New Roman" w:hAnsi="Times New Roman" w:cs="Times New Roman"/>
-              <w:b/>
-              <w:bCs/>
+              <w:noProof/>
             </w:rPr>
             <w:t>3</w:t>
           </w:r>
@@ -1012,9 +1014,7 @@
           </w:r>
           <w:r>
             <w:rPr>
-              <w:rFonts w:ascii="Times New Roman" w:eastAsia="Times New Roman" w:hAnsi="Times New Roman" w:cs="Times New Roman"/>
-              <w:b/>
-              <w:bCs/>
+              <w:noProof/>
             </w:rPr>
             <w:t>4</w:t>
           </w:r>
@@ -1067,11 +1067,12 @@
           </w:r>
           <w:r>
             <w:rPr>
-              <w:rFonts w:ascii="Times New Roman" w:eastAsia="Times New Roman" w:hAnsi="Times New Roman" w:cs="Times New Roman"/>
               <w:b/>
               <w:bCs/>
+              <w:noProof/>
+              <w:lang w:val="en-US"/>
             </w:rPr>
-            <w:t>5</w:t>
+            <w:t>Error! Bookmark not defined.</w:t>
           </w:r>
           <w:r>
             <w:fldChar w:fldCharType="end"/>
@@ -1122,11 +1123,9 @@
           </w:r>
           <w:r>
             <w:rPr>
-              <w:rFonts w:ascii="Times New Roman" w:eastAsia="Times New Roman" w:hAnsi="Times New Roman" w:cs="Times New Roman"/>
-              <w:b/>
-              <w:bCs/>
+              <w:noProof/>
             </w:rPr>
-            <w:t>6</w:t>
+            <w:t>5</w:t>
           </w:r>
           <w:r>
             <w:fldChar w:fldCharType="end"/>
@@ -1172,9 +1171,9 @@
           </w:r>
           <w:r>
             <w:rPr>
-              <w:rFonts w:ascii="Times New Roman" w:eastAsia="Times New Roman" w:hAnsi="Times New Roman" w:cs="Times New Roman"/>
+              <w:noProof/>
             </w:rPr>
-            <w:t>6</w:t>
+            <w:t>5</w:t>
           </w:r>
           <w:r>
             <w:fldChar w:fldCharType="end"/>
@@ -1220,9 +1219,9 @@
           </w:r>
           <w:r>
             <w:rPr>
-              <w:rFonts w:ascii="Times New Roman" w:eastAsia="Times New Roman" w:hAnsi="Times New Roman" w:cs="Times New Roman"/>
+              <w:noProof/>
             </w:rPr>
-            <w:t>6</w:t>
+            <w:t>5</w:t>
           </w:r>
           <w:r>
             <w:fldChar w:fldCharType="end"/>
@@ -1268,9 +1267,9 @@
           </w:r>
           <w:r>
             <w:rPr>
-              <w:rFonts w:ascii="Times New Roman" w:eastAsia="Times New Roman" w:hAnsi="Times New Roman" w:cs="Times New Roman"/>
+              <w:noProof/>
             </w:rPr>
-            <w:t>6</w:t>
+            <w:t>5</w:t>
           </w:r>
           <w:r>
             <w:fldChar w:fldCharType="end"/>
@@ -1316,9 +1315,9 @@
           </w:r>
           <w:r>
             <w:rPr>
-              <w:rFonts w:ascii="Times New Roman" w:eastAsia="Times New Roman" w:hAnsi="Times New Roman" w:cs="Times New Roman"/>
+              <w:noProof/>
             </w:rPr>
-            <w:t>6</w:t>
+            <w:t>5</w:t>
           </w:r>
           <w:r>
             <w:fldChar w:fldCharType="end"/>
@@ -1364,9 +1363,9 @@
           </w:r>
           <w:r>
             <w:rPr>
-              <w:rFonts w:ascii="Times New Roman" w:eastAsia="Times New Roman" w:hAnsi="Times New Roman" w:cs="Times New Roman"/>
+              <w:noProof/>
             </w:rPr>
-            <w:t>7</w:t>
+            <w:t>6</w:t>
           </w:r>
           <w:r>
             <w:fldChar w:fldCharType="end"/>
@@ -1412,9 +1411,9 @@
           </w:r>
           <w:r>
             <w:rPr>
-              <w:rFonts w:ascii="Times New Roman" w:eastAsia="Times New Roman" w:hAnsi="Times New Roman" w:cs="Times New Roman"/>
+              <w:noProof/>
             </w:rPr>
-            <w:t>7</w:t>
+            <w:t>6</w:t>
           </w:r>
           <w:r>
             <w:fldChar w:fldCharType="end"/>
@@ -1460,9 +1459,9 @@
           </w:r>
           <w:r>
             <w:rPr>
-              <w:rFonts w:ascii="Times New Roman" w:eastAsia="Times New Roman" w:hAnsi="Times New Roman" w:cs="Times New Roman"/>
+              <w:noProof/>
             </w:rPr>
-            <w:t>7</w:t>
+            <w:t>6</w:t>
           </w:r>
           <w:r>
             <w:fldChar w:fldCharType="end"/>
@@ -1508,9 +1507,9 @@
           </w:r>
           <w:r>
             <w:rPr>
-              <w:rFonts w:ascii="Times New Roman" w:eastAsia="Times New Roman" w:hAnsi="Times New Roman" w:cs="Times New Roman"/>
+              <w:noProof/>
             </w:rPr>
-            <w:t>7</w:t>
+            <w:t>6</w:t>
           </w:r>
           <w:r>
             <w:fldChar w:fldCharType="end"/>
@@ -1556,7 +1555,7 @@
           </w:r>
           <w:r>
             <w:rPr>
-              <w:rFonts w:ascii="Times New Roman" w:eastAsia="Times New Roman" w:hAnsi="Times New Roman" w:cs="Times New Roman"/>
+              <w:noProof/>
             </w:rPr>
             <w:t>7</w:t>
           </w:r>
@@ -1604,7 +1603,7 @@
           </w:r>
           <w:r>
             <w:rPr>
-              <w:rFonts w:ascii="Times New Roman" w:eastAsia="Times New Roman" w:hAnsi="Times New Roman" w:cs="Times New Roman"/>
+              <w:noProof/>
             </w:rPr>
             <w:t>7</w:t>
           </w:r>
@@ -1652,7 +1651,7 @@
           </w:r>
           <w:r>
             <w:rPr>
-              <w:rFonts w:ascii="Times New Roman" w:eastAsia="Times New Roman" w:hAnsi="Times New Roman" w:cs="Times New Roman"/>
+              <w:noProof/>
             </w:rPr>
             <w:t>7</w:t>
           </w:r>
@@ -1700,7 +1699,7 @@
           </w:r>
           <w:r>
             <w:rPr>
-              <w:rFonts w:ascii="Times New Roman" w:eastAsia="Times New Roman" w:hAnsi="Times New Roman" w:cs="Times New Roman"/>
+              <w:noProof/>
             </w:rPr>
             <w:t>7</w:t>
           </w:r>
@@ -1748,9 +1747,12 @@
           </w:r>
           <w:r>
             <w:rPr>
-              <w:rFonts w:ascii="Times New Roman" w:eastAsia="Times New Roman" w:hAnsi="Times New Roman" w:cs="Times New Roman"/>
+              <w:b/>
+              <w:bCs/>
+              <w:noProof/>
+              <w:lang w:val="en-US"/>
             </w:rPr>
-            <w:t>8</w:t>
+            <w:t>Error! Bookmark not defined.</w:t>
           </w:r>
           <w:r>
             <w:fldChar w:fldCharType="end"/>
@@ -1796,9 +1798,9 @@
           </w:r>
           <w:r>
             <w:rPr>
-              <w:rFonts w:ascii="Times New Roman" w:eastAsia="Times New Roman" w:hAnsi="Times New Roman" w:cs="Times New Roman"/>
+              <w:noProof/>
             </w:rPr>
-            <w:t>8</w:t>
+            <w:t>7</w:t>
           </w:r>
           <w:r>
             <w:fldChar w:fldCharType="end"/>
@@ -1844,9 +1846,9 @@
           </w:r>
           <w:r>
             <w:rPr>
-              <w:rFonts w:ascii="Times New Roman" w:eastAsia="Times New Roman" w:hAnsi="Times New Roman" w:cs="Times New Roman"/>
+              <w:noProof/>
             </w:rPr>
-            <w:t>8</w:t>
+            <w:t>7</w:t>
           </w:r>
           <w:r>
             <w:fldChar w:fldCharType="end"/>
@@ -1892,7 +1894,7 @@
           </w:r>
           <w:r>
             <w:rPr>
-              <w:rFonts w:ascii="Times New Roman" w:eastAsia="Times New Roman" w:hAnsi="Times New Roman" w:cs="Times New Roman"/>
+              <w:noProof/>
             </w:rPr>
             <w:t>8</w:t>
           </w:r>
@@ -1940,9 +1942,12 @@
           </w:r>
           <w:r>
             <w:rPr>
-              <w:rFonts w:ascii="Times New Roman" w:eastAsia="Times New Roman" w:hAnsi="Times New Roman" w:cs="Times New Roman"/>
+              <w:b/>
+              <w:bCs/>
+              <w:noProof/>
+              <w:lang w:val="en-US"/>
             </w:rPr>
-            <w:t>8</w:t>
+            <w:t>Error! Bookmark not defined.</w:t>
           </w:r>
           <w:r>
             <w:fldChar w:fldCharType="end"/>
@@ -1988,9 +1993,12 @@
           </w:r>
           <w:r>
             <w:rPr>
-              <w:rFonts w:ascii="Times New Roman" w:eastAsia="Times New Roman" w:hAnsi="Times New Roman" w:cs="Times New Roman"/>
+              <w:b/>
+              <w:bCs/>
+              <w:noProof/>
+              <w:lang w:val="en-US"/>
             </w:rPr>
-            <w:t>9</w:t>
+            <w:t>Error! Bookmark not defined.</w:t>
           </w:r>
           <w:r>
             <w:fldChar w:fldCharType="end"/>
@@ -2036,9 +2044,9 @@
           </w:r>
           <w:r>
             <w:rPr>
-              <w:rFonts w:ascii="Times New Roman" w:eastAsia="Times New Roman" w:hAnsi="Times New Roman" w:cs="Times New Roman"/>
+              <w:noProof/>
             </w:rPr>
-            <w:t>9</w:t>
+            <w:t>8</w:t>
           </w:r>
           <w:r>
             <w:fldChar w:fldCharType="end"/>
@@ -2084,9 +2092,9 @@
           </w:r>
           <w:r>
             <w:rPr>
-              <w:rFonts w:ascii="Times New Roman" w:eastAsia="Times New Roman" w:hAnsi="Times New Roman" w:cs="Times New Roman"/>
+              <w:noProof/>
             </w:rPr>
-            <w:t>9</w:t>
+            <w:t>8</w:t>
           </w:r>
           <w:r>
             <w:fldChar w:fldCharType="end"/>
@@ -2569,7 +2577,7 @@
                 <w:noProof/>
               </w:rPr>
               <w:drawing>
-                <wp:inline distT="114300" distB="114300" distL="114300" distR="114300">
+                <wp:inline distT="114300" distB="114300" distL="114300" distR="114300" wp14:anchorId="10C19F20" wp14:editId="6F023DE7">
                   <wp:extent cx="1009650" cy="618948"/>
                   <wp:effectExtent l="0" t="0" r="0" b="0"/>
                   <wp:docPr id="8" name="image2.jpg"/>
@@ -2680,7 +2688,7 @@
                 <w:noProof/>
               </w:rPr>
               <w:drawing>
-                <wp:inline distT="114300" distB="114300" distL="114300" distR="114300">
+                <wp:inline distT="114300" distB="114300" distL="114300" distR="114300" wp14:anchorId="440DB85C" wp14:editId="5D667B69">
                   <wp:extent cx="1009650" cy="850900"/>
                   <wp:effectExtent l="0" t="0" r="0" b="0"/>
                   <wp:docPr id="6" name="image3.jpg"/>
@@ -2736,7 +2744,7 @@
                 <w:noProof/>
               </w:rPr>
               <w:drawing>
-                <wp:inline distT="114300" distB="114300" distL="114300" distR="114300">
+                <wp:inline distT="114300" distB="114300" distL="114300" distR="114300" wp14:anchorId="3F994AC1" wp14:editId="76D59F42">
                   <wp:extent cx="1009650" cy="901700"/>
                   <wp:effectExtent l="0" t="0" r="0" b="0"/>
                   <wp:docPr id="4" name="image1.jpg"/>
@@ -3179,7 +3187,7 @@
               <mc:AlternateContent>
                 <mc:Choice Requires="wpg">
                   <w:drawing>
-                    <wp:inline distT="0" distB="0" distL="0" distR="0">
+                    <wp:inline distT="0" distB="0" distL="0" distR="0" wp14:anchorId="7C4B9C50" wp14:editId="7BB89422">
                       <wp:extent cx="2438400" cy="6350"/>
                       <wp:effectExtent l="0" t="0" r="0" b="0"/>
                       <wp:docPr id="2" name="Group 2"/>
@@ -3308,7 +3316,7 @@
                     </wp:inline>
                   </w:drawing>
                 </mc:Choice>
-                <mc:Fallback xmlns:cr="http://schemas.microsoft.com/office/comments/2020/reactions" xmlns="http://schemas.microsoft.com/office/tasks/2019/documenttasks" xmlns:dgm="http://schemas.openxmlformats.org/drawingml/2006/diagram" xmlns:lc="http://schemas.openxmlformats.org/drawingml/2006/lockedCanvas" xmlns:c="http://schemas.openxmlformats.org/drawingml/2006/chart" xmlns:pic="http://schemas.openxmlformats.org/drawingml/2006/picture" xmlns:a="http://schemas.openxmlformats.org/drawingml/2006/main" xmlns:sl="http://schemas.openxmlformats.org/schemaLibrary/2006/main">
+                <mc:Fallback xmlns:sl="http://schemas.openxmlformats.org/schemaLibrary/2006/main" xmlns:a="http://schemas.openxmlformats.org/drawingml/2006/main" xmlns:pic="http://schemas.openxmlformats.org/drawingml/2006/picture" xmlns:c="http://schemas.openxmlformats.org/drawingml/2006/chart" xmlns:lc="http://schemas.openxmlformats.org/drawingml/2006/lockedCanvas" xmlns:dgm="http://schemas.openxmlformats.org/drawingml/2006/diagram" xmlns="http://schemas.microsoft.com/office/tasks/2019/documenttasks" xmlns:cr="http://schemas.microsoft.com/office/comments/2020/reactions">
                   <w:drawing>
                     <wp:inline distB="0" distT="0" distL="0" distR="0">
                       <wp:extent cx="2438400" cy="6350"/>
@@ -3430,7 +3438,7 @@
               <mc:AlternateContent>
                 <mc:Choice Requires="wpg">
                   <w:drawing>
-                    <wp:inline distT="0" distB="0" distL="0" distR="0">
+                    <wp:inline distT="0" distB="0" distL="0" distR="0" wp14:anchorId="7317CBEB" wp14:editId="72F6E20A">
                       <wp:extent cx="2514600" cy="6350"/>
                       <wp:effectExtent l="0" t="0" r="0" b="0"/>
                       <wp:docPr id="1" name="Group 1"/>
@@ -3559,7 +3567,7 @@
                     </wp:inline>
                   </w:drawing>
                 </mc:Choice>
-                <mc:Fallback xmlns:cr="http://schemas.microsoft.com/office/comments/2020/reactions" xmlns="http://schemas.microsoft.com/office/tasks/2019/documenttasks" xmlns:dgm="http://schemas.openxmlformats.org/drawingml/2006/diagram" xmlns:lc="http://schemas.openxmlformats.org/drawingml/2006/lockedCanvas" xmlns:c="http://schemas.openxmlformats.org/drawingml/2006/chart" xmlns:pic="http://schemas.openxmlformats.org/drawingml/2006/picture" xmlns:a="http://schemas.openxmlformats.org/drawingml/2006/main" xmlns:sl="http://schemas.openxmlformats.org/schemaLibrary/2006/main">
+                <mc:Fallback xmlns:sl="http://schemas.openxmlformats.org/schemaLibrary/2006/main" xmlns:a="http://schemas.openxmlformats.org/drawingml/2006/main" xmlns:pic="http://schemas.openxmlformats.org/drawingml/2006/picture" xmlns:c="http://schemas.openxmlformats.org/drawingml/2006/chart" xmlns:lc="http://schemas.openxmlformats.org/drawingml/2006/lockedCanvas" xmlns:dgm="http://schemas.openxmlformats.org/drawingml/2006/diagram" xmlns="http://schemas.microsoft.com/office/tasks/2019/documenttasks" xmlns:cr="http://schemas.microsoft.com/office/comments/2020/reactions">
                   <w:drawing>
                     <wp:inline distB="0" distT="0" distL="0" distR="0">
                       <wp:extent cx="2514600" cy="6350"/>
@@ -3842,7 +3850,7 @@
         <mc:AlternateContent>
           <mc:Choice Requires="wpg">
             <w:drawing>
-              <wp:anchor distT="0" distB="0" distL="0" distR="0" simplePos="0" relativeHeight="251658240" behindDoc="0" locked="0" layoutInCell="1" hidden="0" allowOverlap="1">
+              <wp:anchor distT="0" distB="0" distL="0" distR="0" simplePos="0" relativeHeight="251658240" behindDoc="0" locked="0" layoutInCell="1" hidden="0" allowOverlap="1" wp14:anchorId="044A9A97" wp14:editId="3D193732">
                 <wp:simplePos x="0" y="0"/>
                 <wp:positionH relativeFrom="column">
                   <wp:posOffset>1599722</wp:posOffset>
@@ -3901,7 +3909,7 @@
               </wp:anchor>
             </w:drawing>
           </mc:Choice>
-          <mc:Fallback xmlns:cr="http://schemas.microsoft.com/office/comments/2020/reactions" xmlns="http://schemas.microsoft.com/office/tasks/2019/documenttasks" xmlns:dgm="http://schemas.openxmlformats.org/drawingml/2006/diagram" xmlns:lc="http://schemas.openxmlformats.org/drawingml/2006/lockedCanvas" xmlns:c="http://schemas.openxmlformats.org/drawingml/2006/chart" xmlns:pic="http://schemas.openxmlformats.org/drawingml/2006/picture" xmlns:a="http://schemas.openxmlformats.org/drawingml/2006/main" xmlns:sl="http://schemas.openxmlformats.org/schemaLibrary/2006/main">
+          <mc:Fallback xmlns:sl="http://schemas.openxmlformats.org/schemaLibrary/2006/main" xmlns:a="http://schemas.openxmlformats.org/drawingml/2006/main" xmlns:pic="http://schemas.openxmlformats.org/drawingml/2006/picture" xmlns:c="http://schemas.openxmlformats.org/drawingml/2006/chart" xmlns:lc="http://schemas.openxmlformats.org/drawingml/2006/lockedCanvas" xmlns:dgm="http://schemas.openxmlformats.org/drawingml/2006/diagram" xmlns="http://schemas.microsoft.com/office/tasks/2019/documenttasks" xmlns:cr="http://schemas.microsoft.com/office/comments/2020/reactions">
             <w:drawing>
               <wp:anchor allowOverlap="1" behindDoc="0" distB="0" distT="0" distL="0" distR="0" hidden="0" layoutInCell="1" locked="0" relativeHeight="0" simplePos="0">
                 <wp:simplePos x="0" y="0"/>
@@ -6194,7 +6202,7 @@
           <w:noProof/>
         </w:rPr>
         <w:drawing>
-          <wp:anchor distT="114300" distB="114300" distL="114300" distR="114300" simplePos="0" relativeHeight="251659264" behindDoc="0" locked="0" layoutInCell="1" hidden="0" allowOverlap="1">
+          <wp:anchor distT="114300" distB="114300" distL="114300" distR="114300" simplePos="0" relativeHeight="251659264" behindDoc="0" locked="0" layoutInCell="1" hidden="0" allowOverlap="1" wp14:anchorId="0B6756AE" wp14:editId="1674F8B3">
             <wp:simplePos x="0" y="0"/>
             <wp:positionH relativeFrom="column">
               <wp:posOffset>322425</wp:posOffset>

</xml_diff>